<commit_message>
Use full university name in Education
MBA: Dr. DY Patil University (Online), Navi Mumbai, Maharashtra. The resume
file now puts the institution on its own line so the dates stay on one line.
Resume DOCX/PDF rebuilt.
</commit_message>
<xml_diff>
--- a/assets/Salil_Gokhale_AI_Generalist_Resume.docx
+++ b/assets/Salil_Gokhale_AI_Generalist_Resume.docx
@@ -77,7 +77,7 @@
         </w:rPr>
         <w:t xml:space="preserve">  |  </w:t>
       </w:r>
-      <w:hyperlink w:history="1" r:id="rIdagxzi6-auqzjg_kuvbcrm">
+      <w:hyperlink w:history="1" r:id="rId5nyk3zxkxoerhzrikuu2k">
         <w:r>
           <w:rPr>
             <w:rFonts w:ascii="Arial" w:cs="Arial" w:eastAsia="Arial" w:hAnsi="Arial"/>
@@ -95,7 +95,7 @@
         <w:spacing w:after="40"/>
         <w:jc w:val="center"/>
       </w:pPr>
-      <w:hyperlink w:history="1" r:id="rIdsv7ti_ts1thkzjqsr0itb">
+      <w:hyperlink w:history="1" r:id="rIdx_-zjys27jovakvjtxdyq">
         <w:r>
           <w:rPr>
             <w:rFonts w:ascii="Arial" w:cs="Arial" w:eastAsia="Arial" w:hAnsi="Arial"/>
@@ -116,7 +116,7 @@
         </w:rPr>
         <w:t xml:space="preserve">  |  </w:t>
       </w:r>
-      <w:hyperlink w:history="1" r:id="rIdkl1n8mqsiwxc2ppat0scu">
+      <w:hyperlink w:history="1" r:id="rIdslgkcnw7ymvwjarku6vtr">
         <w:r>
           <w:rPr>
             <w:rFonts w:ascii="Arial" w:cs="Arial" w:eastAsia="Arial" w:hAnsi="Arial"/>
@@ -781,22 +781,27 @@
       <w:r>
         <w:rPr>
           <w:rFonts w:ascii="Arial" w:cs="Arial" w:eastAsia="Arial" w:hAnsi="Arial"/>
+          <w:color w:val="444444"/>
+          <w:sz w:val="19"/>
+          <w:szCs w:val="19"/>
+        </w:rPr>
+        <w:t xml:space="preserve">	2026 – 2028 (expected)</w:t>
+      </w:r>
+    </w:p>
+    <w:p>
+      <w:pPr>
+        <w:spacing w:after="30"/>
+      </w:pPr>
+      <w:r>
+        <w:rPr>
+          <w:rFonts w:ascii="Arial" w:cs="Arial" w:eastAsia="Arial" w:hAnsi="Arial"/>
           <w:i/>
           <w:iCs/>
           <w:color w:val="444444"/>
-          <w:sz w:val="20"/>
-          <w:szCs w:val="20"/>
-        </w:rPr>
-        <w:t xml:space="preserve"> — DY Patil University</w:t>
-      </w:r>
-      <w:r>
-        <w:rPr>
-          <w:rFonts w:ascii="Arial" w:cs="Arial" w:eastAsia="Arial" w:hAnsi="Arial"/>
-          <w:color w:val="444444"/>
-          <w:sz w:val="19"/>
-          <w:szCs w:val="19"/>
-        </w:rPr>
-        <w:t xml:space="preserve">	2026 – 2028 (expected)</w:t>
+          <w:sz w:val="19"/>
+          <w:szCs w:val="19"/>
+        </w:rPr>
+        <w:t xml:space="preserve">Dr. DY Patil University (Online), Navi Mumbai, Maharashtra</w:t>
       </w:r>
     </w:p>
     <w:p>
@@ -820,22 +825,27 @@
       <w:r>
         <w:rPr>
           <w:rFonts w:ascii="Arial" w:cs="Arial" w:eastAsia="Arial" w:hAnsi="Arial"/>
+          <w:color w:val="444444"/>
+          <w:sz w:val="19"/>
+          <w:szCs w:val="19"/>
+        </w:rPr>
+        <w:t xml:space="preserve">	2024</w:t>
+      </w:r>
+    </w:p>
+    <w:p>
+      <w:pPr>
+        <w:spacing w:after="30"/>
+      </w:pPr>
+      <w:r>
+        <w:rPr>
+          <w:rFonts w:ascii="Arial" w:cs="Arial" w:eastAsia="Arial" w:hAnsi="Arial"/>
           <w:i/>
           <w:iCs/>
           <w:color w:val="444444"/>
-          <w:sz w:val="20"/>
-          <w:szCs w:val="20"/>
-        </w:rPr>
-        <w:t xml:space="preserve"> — Dhote Bandhu Science College, Gondia, Maharashtra</w:t>
-      </w:r>
-      <w:r>
-        <w:rPr>
-          <w:rFonts w:ascii="Arial" w:cs="Arial" w:eastAsia="Arial" w:hAnsi="Arial"/>
-          <w:color w:val="444444"/>
-          <w:sz w:val="19"/>
-          <w:szCs w:val="19"/>
-        </w:rPr>
-        <w:t xml:space="preserve">	2024</w:t>
+          <w:sz w:val="19"/>
+          <w:szCs w:val="19"/>
+        </w:rPr>
+        <w:t xml:space="preserve">Dhote Bandhu Science College, Gondia, Maharashtra</w:t>
       </w:r>
     </w:p>
     <w:p>

</xml_diff>

<commit_message>
Add portfolio link to the resume
Resume contact line now includes Portfolio: salil360-cyber.github.io as a
clickable link. Resume DOCX/PDF rebuilt.
</commit_message>
<xml_diff>
--- a/assets/Salil_Gokhale_AI_Generalist_Resume.docx
+++ b/assets/Salil_Gokhale_AI_Generalist_Resume.docx
@@ -77,7 +77,7 @@
         </w:rPr>
         <w:t xml:space="preserve">  |  </w:t>
       </w:r>
-      <w:hyperlink w:history="1" r:id="rId5nyk3zxkxoerhzrikuu2k">
+      <w:hyperlink w:history="1" r:id="rIdfhz2vwzua5ycbujisdm6t">
         <w:r>
           <w:rPr>
             <w:rFonts w:ascii="Arial" w:cs="Arial" w:eastAsia="Arial" w:hAnsi="Arial"/>
@@ -95,7 +95,7 @@
         <w:spacing w:after="40"/>
         <w:jc w:val="center"/>
       </w:pPr>
-      <w:hyperlink w:history="1" r:id="rIdx_-zjys27jovakvjtxdyq">
+      <w:hyperlink w:history="1" r:id="rIdurljotfoh1fkspy7pej1g">
         <w:r>
           <w:rPr>
             <w:rFonts w:ascii="Arial" w:cs="Arial" w:eastAsia="Arial" w:hAnsi="Arial"/>
@@ -116,7 +116,7 @@
         </w:rPr>
         <w:t xml:space="preserve">  |  </w:t>
       </w:r>
-      <w:hyperlink w:history="1" r:id="rIdslgkcnw7ymvwjarku6vtr">
+      <w:hyperlink w:history="1" r:id="rIdqa8pfkne1mi2dk278opkg">
         <w:r>
           <w:rPr>
             <w:rFonts w:ascii="Arial" w:cs="Arial" w:eastAsia="Arial" w:hAnsi="Arial"/>
@@ -126,6 +126,27 @@
             <w:u w:val="single"/>
           </w:rPr>
           <w:t xml:space="preserve">GitHub: github.com/Salil360-cyber</w:t>
+        </w:r>
+      </w:hyperlink>
+      <w:r>
+        <w:rPr>
+          <w:rFonts w:ascii="Arial" w:cs="Arial" w:eastAsia="Arial" w:hAnsi="Arial"/>
+          <w:color w:val="444444"/>
+          <w:sz w:val="19"/>
+          <w:szCs w:val="19"/>
+        </w:rPr>
+        <w:t xml:space="preserve">  |  </w:t>
+      </w:r>
+      <w:hyperlink w:history="1" r:id="rIdsdkn_rhal_6ks5g-j4lqg">
+        <w:r>
+          <w:rPr>
+            <w:rFonts w:ascii="Arial" w:cs="Arial" w:eastAsia="Arial" w:hAnsi="Arial"/>
+            <w:color w:val="1A1A1A"/>
+            <w:sz w:val="19"/>
+            <w:szCs w:val="19"/>
+            <w:u w:val="single"/>
+          </w:rPr>
+          <w:t xml:space="preserve">Portfolio: salil360-cyber.github.io</w:t>
         </w:r>
       </w:hyperlink>
     </w:p>

</xml_diff>